<commit_message>
Update assignment plan with comprehensive gap analysis and technical limitations
</commit_message>
<xml_diff>
--- a/CS499_Module_One_Assignment_Mohannad_Abuimeish.docx
+++ b/CS499_Module_One_Assignment_Mohannad_Abuimeish.docx
@@ -624,7 +624,7 @@
           <w:color w:val="333333"/>
           <w:sz w:val="22"/>
         </w:rPr>
-        <w:t>CS 320: Software Testing, Automation, and Quality Assurance (Repository: BoomBloom/CS320-final-project)</w:t>
+        <w:t>CS 320: Software Testing, Automation, and Quality Assurance (Repository: BoomBloom/CS320-final-project; Local Path: artifacts/software-design/original/)</w:t>
       </w:r>
     </w:p>
     <w:p>
@@ -674,7 +674,7 @@
           <w:color w:val="333333"/>
           <w:sz w:val="22"/>
         </w:rPr>
-        <w:t>To demonstrate enterprise software engineering and architecture, I plan to refactor this monolith into a modular, production-grade layered REST service adhering to the Controller-Service-Repository pattern:</w:t>
+        <w:t>To demonstrate enterprise software engineering and architecture, I plan to refactor this monolith into a modular, production-grade layered REST service adhering to the Controller-Service-Repository pattern. As detailed in the architectural pseudocode below, the enhancement decouples client routing from data storage and enforces object immutability:</w:t>
       </w:r>
     </w:p>
     <w:p>
@@ -720,7 +720,7 @@
           <w:color w:val="333333"/>
           <w:sz w:val="22"/>
         </w:rPr>
-        <w:t xml:space="preserve"> Implement the Builder Pattern for complex entity creation to ensure immutable objects with strict pre-condition checks, and the Factory Pattern for standardizing service responses.</w:t>
+        <w:t xml:space="preserve"> Implement the Builder Pattern for complex entity creation to ensure immutable objects with strict pre-condition checks, and the Factory Pattern for standardizing service responses (see pseudocode below).</w:t>
       </w:r>
     </w:p>
     <w:p>
@@ -782,6 +782,19 @@
           <w:sz w:val="23"/>
         </w:rPr>
         <w:t>Enhancement Pseudocode (GoF Builder Pattern &amp; Layered Service):</w:t>
+      </w:r>
+    </w:p>
+    <w:p>
+      <w:pPr>
+        <w:spacing w:before="0" w:after="120" w:line="276" w:lineRule="auto"/>
+      </w:pPr>
+      <w:r>
+        <w:rPr>
+          <w:rFonts w:ascii="Calibri" w:hAnsi="Calibri"/>
+          <w:color w:val="333333"/>
+          <w:sz w:val="22"/>
+        </w:rPr>
+        <w:t>As illustrated in the pseudocode implementation below, the Contact class utilizes an immutable private constructor paired with a static Builder class. This enforces fail-fast input validation before the object is ever instantiated, while the ContactService injects the repository dependency to isolate business rules from persistence:</w:t>
       </w:r>
     </w:p>
     <w:tbl>
@@ -1140,7 +1153,7 @@
           <w:color w:val="333333"/>
           <w:sz w:val="22"/>
         </w:rPr>
-        <w:t>CS 300: Data Structures and Algorithms (Repository: BoomBloom/CS300-ABCU-Advising-Program)</w:t>
+        <w:t>CS 300: Data Structures and Algorithms (Repository: BoomBloom/CS300-ABCU-Advising-Program; Local Path: artifacts/algorithms/original/CS-300 Project Two.cpp)</w:t>
       </w:r>
     </w:p>
     <w:p>
@@ -1190,7 +1203,7 @@
           <w:color w:val="333333"/>
           <w:sz w:val="22"/>
         </w:rPr>
-        <w:t>In the original BST, inserting pre-sorted course data causes the tree to degenerate into a linear linked list with worst-case search complexity of O(n). To optimize this:</w:t>
+        <w:t>In the original BST, inserting pre-sorted course data causes the tree to degenerate into a linear linked list with worst-case search complexity of O(n). To optimize this, the enhancement introduces automatic rotational self-balancing and RAII memory safety, as detailed in the algorithmic pseudocode below:</w:t>
       </w:r>
     </w:p>
     <w:p>
@@ -1275,6 +1288,19 @@
           <w:sz w:val="23"/>
         </w:rPr>
         <w:t>Enhancement Pseudocode (AVL Balance &amp; Rotations in Modern C++):</w:t>
+      </w:r>
+    </w:p>
+    <w:p>
+      <w:pPr>
+        <w:spacing w:before="0" w:after="120" w:line="276" w:lineRule="auto"/>
+      </w:pPr>
+      <w:r>
+        <w:rPr>
+          <w:rFonts w:ascii="Calibri" w:hAnsi="Calibri"/>
+          <w:color w:val="333333"/>
+          <w:sz w:val="22"/>
+        </w:rPr>
+        <w:t>As illustrated in the pseudocode below, every recursive node insertion evaluates the height difference between subtrees. If a balance factor exceeds +/-1, the appropriate single or double rotation (rotateLeft / rotateRight) executes via std::move semantics, maintaining strict logarithmic depth:</w:t>
       </w:r>
     </w:p>
     <w:tbl>
@@ -1624,7 +1650,7 @@
           <w:color w:val="333333"/>
           <w:sz w:val="22"/>
         </w:rPr>
-        <w:t>CS 340: Advanced Programming Concepts / Client-Server Development (Repository: BoomBloom/CS340-Grazioso-Salvare-Dashboard)</w:t>
+        <w:t>CS 340: Advanced Programming Concepts / Client-Server Development (Repository: BoomBloom/CS340-Grazioso-Salvare-Dashboard; Local Path: artifacts/databases/original/)</w:t>
       </w:r>
     </w:p>
     <w:p>
@@ -1674,7 +1700,7 @@
           <w:color w:val="333333"/>
           <w:sz w:val="22"/>
         </w:rPr>
-        <w:t>To advance this artifact to commercial standards, I will transform it into an authenticated, high-performance database service:</w:t>
+        <w:t>To advance this artifact to commercial standards, I will transform it into an authenticated, high-performance database service. As shown in the database pseudocode below, the enhancement delegates aggregation workloads directly to the database engine and enforces indexing:</w:t>
       </w:r>
     </w:p>
     <w:p>
@@ -1766,7 +1792,7 @@
           <w:color w:val="333333"/>
           <w:sz w:val="22"/>
         </w:rPr>
-        <w:t xml:space="preserve"> Replace client-side Python array filtering with server-side MongoDB Aggregation Pipelines ($match, $group, $facet, $project), delegating analytical heavy lifting directly to the database engine.</w:t>
+        <w:t xml:space="preserve"> Replace client-side Python array filtering with server-side MongoDB Aggregation Pipelines ($match, $group, $facet, $project), delegating analytical heavy lifting directly to the database engine (see pseudocode below).</w:t>
       </w:r>
     </w:p>
     <w:p>
@@ -1782,6 +1808,19 @@
           <w:sz w:val="23"/>
         </w:rPr>
         <w:t>Enhancement Pseudocode (Secure Indexed Aggregation Pipeline):</w:t>
+      </w:r>
+    </w:p>
+    <w:p>
+      <w:pPr>
+        <w:spacing w:before="0" w:after="120" w:line="276" w:lineRule="auto"/>
+      </w:pPr>
+      <w:r>
+        <w:rPr>
+          <w:rFonts w:ascii="Calibri" w:hAnsi="Calibri"/>
+          <w:color w:val="333333"/>
+          <w:sz w:val="22"/>
+        </w:rPr>
+        <w:t>As illustrated in the pseudocode below, the database service initializes compound indexes upon connection and executes a multi-stage server-side aggregation pipeline. This drastically cuts network latency and memory overhead by filtering and computing metrics inside MongoDB:</w:t>
       </w:r>
     </w:p>
     <w:tbl>
@@ -2354,6 +2393,289 @@
           <w:sz w:val="22"/>
         </w:rPr>
         <w:t xml:space="preserve"> Demonstrates how the cumulative curriculum and capstone enhancements integrate to form an industry-ready professional profile equipped to build secure, scalable, and collaborative software systems.</w:t>
+      </w:r>
+    </w:p>
+    <w:p>
+      <w:pPr>
+        <w:keepNext/>
+        <w:spacing w:before="240" w:after="80"/>
+      </w:pPr>
+      <w:r>
+        <w:rPr>
+          <w:rFonts w:ascii="Calibri" w:hAnsi="Calibri"/>
+          <w:b/>
+          <w:color w:val="0F172A"/>
+          <w:sz w:val="25"/>
+        </w:rPr>
+        <w:t>Comprehensive Evaluation of Enhancement Plans and Course Outcomes</w:t>
+      </w:r>
+    </w:p>
+    <w:p>
+      <w:pPr>
+        <w:keepNext/>
+        <w:spacing w:before="160" w:after="40"/>
+      </w:pPr>
+      <w:r>
+        <w:rPr>
+          <w:rFonts w:ascii="Calibri" w:hAnsi="Calibri"/>
+          <w:b/>
+          <w:color w:val="2563EB"/>
+          <w:sz w:val="23"/>
+        </w:rPr>
+        <w:t>A. Specific Skills and Knowledge Demonstrated:</w:t>
+      </w:r>
+    </w:p>
+    <w:p>
+      <w:pPr>
+        <w:spacing w:before="0" w:after="120" w:line="276" w:lineRule="auto"/>
+      </w:pPr>
+      <w:r>
+        <w:rPr>
+          <w:rFonts w:ascii="Calibri" w:hAnsi="Calibri"/>
+          <w:color w:val="333333"/>
+          <w:sz w:val="22"/>
+        </w:rPr>
+        <w:t>Fulfilling these enhancement plans will demonstrate full-stack software development competence, including clean architecture design patterns, rigorous unit testing, memory-safe data structure implementations, algorithmic complexity management, and secure database optimization. It proves my ability to take existing legacy codebases, perform vulnerability and efficiency audits, and refactor them into enterprise-grade systems.</w:t>
+      </w:r>
+    </w:p>
+    <w:p>
+      <w:pPr>
+        <w:keepNext/>
+        <w:spacing w:before="160" w:after="40"/>
+      </w:pPr>
+      <w:r>
+        <w:rPr>
+          <w:rFonts w:ascii="Calibri" w:hAnsi="Calibri"/>
+          <w:b/>
+          <w:color w:val="2563EB"/>
+          <w:sz w:val="23"/>
+        </w:rPr>
+        <w:t>B. Analysis of Course Outcome Coverage and Gap Assessment:</w:t>
+      </w:r>
+    </w:p>
+    <w:p>
+      <w:pPr>
+        <w:spacing w:before="0" w:after="120" w:line="276" w:lineRule="auto"/>
+      </w:pPr>
+      <w:r>
+        <w:rPr>
+          <w:rFonts w:ascii="Calibri" w:hAnsi="Calibri"/>
+          <w:color w:val="333333"/>
+          <w:sz w:val="22"/>
+        </w:rPr>
+        <w:t>A rigorous audit of the five course outcomes against the three planned enhancements reveals zero substantive coverage gaps:</w:t>
+      </w:r>
+    </w:p>
+    <w:p>
+      <w:pPr>
+        <w:pStyle w:val="ListBullet"/>
+        <w:spacing w:before="0" w:after="80" w:line="276" w:lineRule="auto"/>
+      </w:pPr>
+      <w:r>
+        <w:rPr>
+          <w:rFonts w:ascii="Calibri" w:hAnsi="Calibri"/>
+          <w:b/>
+          <w:color w:val="0F172A"/>
+          <w:sz w:val="22"/>
+        </w:rPr>
+        <w:t>Outcome 1 (Collaboration &amp; Stakeholder Decision-Making):</w:t>
+      </w:r>
+      <w:r>
+        <w:rPr>
+          <w:rFonts w:ascii="Calibri" w:hAnsi="Calibri"/>
+          <w:color w:val="333333"/>
+          <w:sz w:val="22"/>
+        </w:rPr>
+        <w:t xml:space="preserve"> Demonstrated in the Milestone One code review walkthrough, standardized Javadoc/Doxygen documentation, and decoupled multi-tier architecture enabling team collaboration.</w:t>
+      </w:r>
+    </w:p>
+    <w:p>
+      <w:pPr>
+        <w:pStyle w:val="ListBullet"/>
+        <w:spacing w:before="0" w:after="80" w:line="276" w:lineRule="auto"/>
+      </w:pPr>
+      <w:r>
+        <w:rPr>
+          <w:rFonts w:ascii="Calibri" w:hAnsi="Calibri"/>
+          <w:b/>
+          <w:color w:val="0F172A"/>
+          <w:sz w:val="22"/>
+        </w:rPr>
+        <w:t>Outcome 2 (Professional Communications):</w:t>
+      </w:r>
+      <w:r>
+        <w:rPr>
+          <w:rFonts w:ascii="Calibri" w:hAnsi="Calibri"/>
+          <w:color w:val="333333"/>
+          <w:sz w:val="22"/>
+        </w:rPr>
+        <w:t xml:space="preserve"> Demonstrated through professional written narratives, visual architecture diagrams, and screencast oral code reviews.</w:t>
+      </w:r>
+    </w:p>
+    <w:p>
+      <w:pPr>
+        <w:pStyle w:val="ListBullet"/>
+        <w:spacing w:before="0" w:after="80" w:line="276" w:lineRule="auto"/>
+      </w:pPr>
+      <w:r>
+        <w:rPr>
+          <w:rFonts w:ascii="Calibri" w:hAnsi="Calibri"/>
+          <w:b/>
+          <w:color w:val="0F172A"/>
+          <w:sz w:val="22"/>
+        </w:rPr>
+        <w:t>Outcome 3 (Algorithmic Principles &amp; Trade-offs):</w:t>
+      </w:r>
+      <w:r>
+        <w:rPr>
+          <w:rFonts w:ascii="Calibri" w:hAnsi="Calibri"/>
+          <w:color w:val="333333"/>
+          <w:sz w:val="22"/>
+        </w:rPr>
+        <w:t xml:space="preserve"> Demonstrated through AVL tree balancing mathematics and rotation routines (guaranteed O(log n)) in Category Two, as well as database compound indexing and server-side aggregation pipelines in Category Three.</w:t>
+      </w:r>
+    </w:p>
+    <w:p>
+      <w:pPr>
+        <w:pStyle w:val="ListBullet"/>
+        <w:spacing w:before="0" w:after="80" w:line="276" w:lineRule="auto"/>
+      </w:pPr>
+      <w:r>
+        <w:rPr>
+          <w:rFonts w:ascii="Calibri" w:hAnsi="Calibri"/>
+          <w:b/>
+          <w:color w:val="0F172A"/>
+          <w:sz w:val="22"/>
+        </w:rPr>
+        <w:t>Outcome 4 (Tools, Techniques, &amp; Industry Goals):</w:t>
+      </w:r>
+      <w:r>
+        <w:rPr>
+          <w:rFonts w:ascii="Calibri" w:hAnsi="Calibri"/>
+          <w:color w:val="333333"/>
+          <w:sz w:val="22"/>
+        </w:rPr>
+        <w:t xml:space="preserve"> Demonstrated through industry-standard tooling, including JUnit 5, Mockito, FastAPI, PyMongo, Docker, and modern C++20 smart pointer idioms.</w:t>
+      </w:r>
+    </w:p>
+    <w:p>
+      <w:pPr>
+        <w:pStyle w:val="ListBullet"/>
+        <w:spacing w:before="0" w:after="80" w:line="276" w:lineRule="auto"/>
+      </w:pPr>
+      <w:r>
+        <w:rPr>
+          <w:rFonts w:ascii="Calibri" w:hAnsi="Calibri"/>
+          <w:b/>
+          <w:color w:val="0F172A"/>
+          <w:sz w:val="22"/>
+        </w:rPr>
+        <w:t>Outcome 5 (Security Mindset):</w:t>
+      </w:r>
+      <w:r>
+        <w:rPr>
+          <w:rFonts w:ascii="Calibri" w:hAnsi="Calibri"/>
+          <w:color w:val="333333"/>
+          <w:sz w:val="22"/>
+        </w:rPr>
+        <w:t xml:space="preserve"> Demonstrated through defensive validation (Category One), credential isolation via environment variables, and parameterized schema enforcement (Category Three).</w:t>
+      </w:r>
+    </w:p>
+    <w:p>
+      <w:pPr>
+        <w:keepNext/>
+        <w:spacing w:before="160" w:after="40"/>
+      </w:pPr>
+      <w:r>
+        <w:rPr>
+          <w:rFonts w:ascii="Calibri" w:hAnsi="Calibri"/>
+          <w:b/>
+          <w:color w:val="2563EB"/>
+          <w:sz w:val="23"/>
+        </w:rPr>
+        <w:t>C. Identified Technical Limitations and Weaknesses to Address:</w:t>
+      </w:r>
+    </w:p>
+    <w:p>
+      <w:pPr>
+        <w:spacing w:before="0" w:after="120" w:line="276" w:lineRule="auto"/>
+      </w:pPr>
+      <w:r>
+        <w:rPr>
+          <w:rFonts w:ascii="Calibri" w:hAnsi="Calibri"/>
+          <w:color w:val="333333"/>
+          <w:sz w:val="22"/>
+        </w:rPr>
+        <w:t>While the proposed enhancements significantly elevate each artifact, the following known constraints and design trade-offs will be addressed during implementation:</w:t>
+      </w:r>
+    </w:p>
+    <w:p>
+      <w:pPr>
+        <w:pStyle w:val="ListBullet"/>
+        <w:spacing w:before="0" w:after="80" w:line="276" w:lineRule="auto"/>
+      </w:pPr>
+      <w:r>
+        <w:rPr>
+          <w:rFonts w:ascii="Calibri" w:hAnsi="Calibri"/>
+          <w:b/>
+          <w:color w:val="0F172A"/>
+          <w:sz w:val="22"/>
+        </w:rPr>
+        <w:t>1. AVL Tree Rotational Overhead:</w:t>
+      </w:r>
+      <w:r>
+        <w:rPr>
+          <w:rFonts w:ascii="Calibri" w:hAnsi="Calibri"/>
+          <w:color w:val="333333"/>
+          <w:sz w:val="22"/>
+        </w:rPr>
+        <w:t xml:space="preserve"> The AVL Tree provides guaranteed O(log n) lookup at the cost of frequent rotations during write-heavy workloads. During milestone testing, I will analyze rotation overhead versus insertion volume to determine if a Red-Black Tree would provide superior throughput for dynamic datasets.</w:t>
+      </w:r>
+    </w:p>
+    <w:p>
+      <w:pPr>
+        <w:pStyle w:val="ListBullet"/>
+        <w:spacing w:before="0" w:after="80" w:line="276" w:lineRule="auto"/>
+      </w:pPr>
+      <w:r>
+        <w:rPr>
+          <w:rFonts w:ascii="Calibri" w:hAnsi="Calibri"/>
+          <w:b/>
+          <w:color w:val="0F172A"/>
+          <w:sz w:val="22"/>
+        </w:rPr>
+        <w:t>2. Persistence Layer Isolation:</w:t>
+      </w:r>
+      <w:r>
+        <w:rPr>
+          <w:rFonts w:ascii="Calibri" w:hAnsi="Calibri"/>
+          <w:color w:val="333333"/>
+          <w:sz w:val="22"/>
+        </w:rPr>
+        <w:t xml:space="preserve"> In Category One, the service layer will initially be tested against in-memory repository doubles. To ensure production parity, an embedded JPA/H2 database tier will be introduced in subsequent iterations to test transaction rollbacks and persistence boundaries.</w:t>
+      </w:r>
+    </w:p>
+    <w:p>
+      <w:pPr>
+        <w:pStyle w:val="ListBullet"/>
+        <w:spacing w:before="0" w:after="80" w:line="276" w:lineRule="auto"/>
+      </w:pPr>
+      <w:r>
+        <w:rPr>
+          <w:rFonts w:ascii="Calibri" w:hAnsi="Calibri"/>
+          <w:b/>
+          <w:color w:val="0F172A"/>
+          <w:sz w:val="22"/>
+        </w:rPr>
+        <w:t>3. Distributed Database Scaling:</w:t>
+      </w:r>
+      <w:r>
+        <w:rPr>
+          <w:rFonts w:ascii="Calibri" w:hAnsi="Calibri"/>
+          <w:color w:val="333333"/>
+          <w:sz w:val="22"/>
+        </w:rPr>
+        <w:t xml:space="preserve"> The MongoDB aggregation pipeline is designed for a single-node deployment. In enterprise deployments, shard keys and distributed query routing would need to be evaluated to maintain aggregation performance across multiple clusters.</w:t>
       </w:r>
     </w:p>
     <w:p>

</xml_diff>